<commit_message>
dd Portfolio documents — scrubbed for public release
</commit_message>
<xml_diff>
--- a/Portfolio/CAC-Program-Public-Blueprint.docx
+++ b/Portfolio/CAC-Program-Public-Blueprint.docx
@@ -3189,7 +3189,7 @@
                 <w:rStyle w:val="Hyperlink"/>
                 <w:noProof/>
               </w:rPr>
-              <w:t>6.1.2 Lab Naming - Use lab.local, NOT lab.metcom.org</w:t>
+              <w:t>6.1.2 Lab Naming - Use lab.local, NOT lab.agency.gov</w:t>
             </w:r>
             <w:r>
               <w:rPr>
@@ -22567,7 +22567,7 @@
         <w:spacing w:after="60"/>
       </w:pPr>
       <w:r>
-        <w:t>Dedicated VLAN or subnet for lab VMs (e.g., 10.99.0.0/24) - any private range that is not already in production use.</w:t>
+        <w:t>Dedicated VLAN or subnet for lab VMs (e.g., 10.0.0.0/24) - any private range that is not already in production use.</w:t>
       </w:r>
     </w:p>
     <w:p>

</xml_diff>